<commit_message>
[Lane 1] USA26046: Crude/HDS/Coker reports signed by Peter Campbell; Coker flow tables widened, centered, single-row headers
Co-Authored-By: Claude Opus 5.5 <noreply@anthropic.com>
Claude-Session: https://claude.ai/code/session_01Ht6kBvc4F6ALGQpBMyBmaF
</commit_message>
<xml_diff>
--- a/02-facilities/Cenovus/Lima-OH/USA26046-PR-170002-Coker-Job-Report.docx
+++ b/02-facilities/Cenovus/Lima-OH/USA26046-PR-170002-Coker-Job-Report.docx
@@ -2493,6 +2493,7 @@
           <w:left w:w="60" w:type="dxa"/>
           <w:right w:w="60" w:type="dxa"/>
         </w:tblCellMar>
+        <w:jc w:val="center"/>
       </w:tblPr>
       <w:tblGrid>
         <w:gridCol w:w="3312"/>
@@ -2524,7 +2525,7 @@
           </w:p>
           <w:tbl>
             <w:tblPr>
-              <w:tblW w:type="auto" w:w="0"/>
+              <w:tblW w:type="dxa" w:w="3192"/>
               <w:tblLook w:firstColumn="1" w:firstRow="1" w:lastColumn="0" w:lastRow="0" w:noHBand="0" w:noVBand="1" w:val="04A0"/>
               <w:tblLayout w:type="fixed"/>
               <w:tblBorders>
@@ -2535,28 +2536,28 @@
                 <w:insideH w:val="single" w:sz="4" w:space="0" w:color="DDDDDD"/>
                 <w:insideV w:val="single" w:sz="4" w:space="0" w:color="DDDDDD"/>
               </w:tblBorders>
+              <w:jc w:val="center"/>
               <w:tblCellMar>
-                <w:top w:w="8" w:type="dxa"/>
-                <w:bottom w:w="8" w:type="dxa"/>
-                <w:left w:w="60" w:type="dxa"/>
-                <w:right w:w="60" w:type="dxa"/>
+                <w:left w:w="50" w:type="dxa"/>
+                <w:right w:w="50" w:type="dxa"/>
               </w:tblCellMar>
             </w:tblPr>
             <w:tblGrid>
-              <w:gridCol w:w="684"/>
-              <w:gridCol w:w="840"/>
-              <w:gridCol w:w="840"/>
-              <w:gridCol w:w="746"/>
+              <w:gridCol w:w="540"/>
+              <w:gridCol w:w="1060"/>
+              <w:gridCol w:w="1000"/>
+              <w:gridCol w:w="592"/>
             </w:tblGrid>
             <w:tr>
               <w:tc>
                 <w:tcPr>
-                  <w:tcW w:type="dxa" w:w="685"/>
+                  <w:tcW w:type="dxa" w:w="540"/>
                   <w:shd w:val="clear" w:fill="222222"/>
                 </w:tcPr>
                 <w:p>
                   <w:pPr>
                     <w:spacing w:before="20" w:after="20" w:line="240" w:lineRule="auto"/>
+                    <w:jc w:val="center"/>
                   </w:pPr>
                   <w:r/>
                   <w:r>
@@ -2572,12 +2573,13 @@
               </w:tc>
               <w:tc>
                 <w:tcPr>
-                  <w:tcW w:type="dxa" w:w="840"/>
+                  <w:tcW w:type="dxa" w:w="1060"/>
                   <w:shd w:val="clear" w:fill="222222"/>
                 </w:tcPr>
                 <w:p>
                   <w:pPr>
                     <w:spacing w:before="20" w:after="20" w:line="240" w:lineRule="auto"/>
+                    <w:jc w:val="center"/>
                   </w:pPr>
                   <w:r/>
                   <w:r>
@@ -2593,12 +2595,13 @@
               </w:tc>
               <w:tc>
                 <w:tcPr>
-                  <w:tcW w:type="dxa" w:w="840"/>
+                  <w:tcW w:type="dxa" w:w="1000"/>
                   <w:shd w:val="clear" w:fill="222222"/>
                 </w:tcPr>
                 <w:p>
                   <w:pPr>
                     <w:spacing w:before="20" w:after="20" w:line="240" w:lineRule="auto"/>
+                    <w:jc w:val="center"/>
                   </w:pPr>
                   <w:r/>
                   <w:r>
@@ -2614,12 +2617,13 @@
               </w:tc>
               <w:tc>
                 <w:tcPr>
-                  <w:tcW w:type="dxa" w:w="747"/>
+                  <w:tcW w:type="dxa" w:w="592"/>
                   <w:shd w:val="clear" w:fill="222222"/>
                 </w:tcPr>
                 <w:p>
                   <w:pPr>
                     <w:spacing w:before="20" w:after="20" w:line="240" w:lineRule="auto"/>
+                    <w:jc w:val="center"/>
                   </w:pPr>
                   <w:r/>
                   <w:r>
@@ -2637,7 +2641,7 @@
             <w:tr>
               <w:tc>
                 <w:tcPr>
-                  <w:tcW w:type="dxa" w:w="685"/>
+                  <w:tcW w:type="dxa" w:w="540"/>
                 </w:tcPr>
                 <w:p>
                   <w:pPr>
@@ -2658,7 +2662,7 @@
               </w:tc>
               <w:tc>
                 <w:tcPr>
-                  <w:tcW w:type="dxa" w:w="840"/>
+                  <w:tcW w:type="dxa" w:w="1060"/>
                 </w:tcPr>
                 <w:p>
                   <w:pPr>
@@ -2679,7 +2683,7 @@
               </w:tc>
               <w:tc>
                 <w:tcPr>
-                  <w:tcW w:type="dxa" w:w="840"/>
+                  <w:tcW w:type="dxa" w:w="1000"/>
                 </w:tcPr>
                 <w:p>
                   <w:pPr>
@@ -2700,7 +2704,7 @@
               </w:tc>
               <w:tc>
                 <w:tcPr>
-                  <w:tcW w:type="dxa" w:w="747"/>
+                  <w:tcW w:type="dxa" w:w="592"/>
                 </w:tcPr>
                 <w:p>
                   <w:pPr>
@@ -2723,7 +2727,7 @@
             <w:tr>
               <w:tc>
                 <w:tcPr>
-                  <w:tcW w:type="dxa" w:w="685"/>
+                  <w:tcW w:type="dxa" w:w="540"/>
                   <w:shd w:val="clear" w:fill="F7F7F7"/>
                 </w:tcPr>
                 <w:p>
@@ -2745,7 +2749,7 @@
               </w:tc>
               <w:tc>
                 <w:tcPr>
-                  <w:tcW w:type="dxa" w:w="840"/>
+                  <w:tcW w:type="dxa" w:w="1060"/>
                   <w:shd w:val="clear" w:fill="F7F7F7"/>
                 </w:tcPr>
                 <w:p>
@@ -2767,7 +2771,7 @@
               </w:tc>
               <w:tc>
                 <w:tcPr>
-                  <w:tcW w:type="dxa" w:w="840"/>
+                  <w:tcW w:type="dxa" w:w="1000"/>
                   <w:shd w:val="clear" w:fill="F7F7F7"/>
                 </w:tcPr>
                 <w:p>
@@ -2789,7 +2793,7 @@
               </w:tc>
               <w:tc>
                 <w:tcPr>
-                  <w:tcW w:type="dxa" w:w="747"/>
+                  <w:tcW w:type="dxa" w:w="592"/>
                   <w:shd w:val="clear" w:fill="F7F7F7"/>
                 </w:tcPr>
                 <w:p>
@@ -2813,7 +2817,7 @@
             <w:tr>
               <w:tc>
                 <w:tcPr>
-                  <w:tcW w:type="dxa" w:w="685"/>
+                  <w:tcW w:type="dxa" w:w="540"/>
                 </w:tcPr>
                 <w:p>
                   <w:pPr>
@@ -2834,7 +2838,7 @@
               </w:tc>
               <w:tc>
                 <w:tcPr>
-                  <w:tcW w:type="dxa" w:w="840"/>
+                  <w:tcW w:type="dxa" w:w="1060"/>
                 </w:tcPr>
                 <w:p>
                   <w:pPr>
@@ -2855,7 +2859,7 @@
               </w:tc>
               <w:tc>
                 <w:tcPr>
-                  <w:tcW w:type="dxa" w:w="840"/>
+                  <w:tcW w:type="dxa" w:w="1000"/>
                 </w:tcPr>
                 <w:p>
                   <w:pPr>
@@ -2876,7 +2880,7 @@
               </w:tc>
               <w:tc>
                 <w:tcPr>
-                  <w:tcW w:type="dxa" w:w="747"/>
+                  <w:tcW w:type="dxa" w:w="592"/>
                 </w:tcPr>
                 <w:p>
                   <w:pPr>
@@ -2897,7 +2901,9 @@
               </w:tc>
             </w:tr>
           </w:tbl>
-          <w:p/>
+          <w:p>
+            <w:pPr/>
+          </w:p>
         </w:tc>
         <w:tc>
           <w:tcPr>
@@ -2920,7 +2926,7 @@
           </w:p>
           <w:tbl>
             <w:tblPr>
-              <w:tblW w:type="auto" w:w="0"/>
+              <w:tblW w:type="dxa" w:w="3192"/>
               <w:tblLook w:firstColumn="1" w:firstRow="1" w:lastColumn="0" w:lastRow="0" w:noHBand="0" w:noVBand="1" w:val="04A0"/>
               <w:tblLayout w:type="fixed"/>
               <w:tblBorders>
@@ -2931,28 +2937,28 @@
                 <w:insideH w:val="single" w:sz="4" w:space="0" w:color="DDDDDD"/>
                 <w:insideV w:val="single" w:sz="4" w:space="0" w:color="DDDDDD"/>
               </w:tblBorders>
+              <w:jc w:val="center"/>
               <w:tblCellMar>
-                <w:top w:w="8" w:type="dxa"/>
-                <w:bottom w:w="8" w:type="dxa"/>
-                <w:left w:w="60" w:type="dxa"/>
-                <w:right w:w="60" w:type="dxa"/>
+                <w:left w:w="50" w:type="dxa"/>
+                <w:right w:w="50" w:type="dxa"/>
               </w:tblCellMar>
             </w:tblPr>
             <w:tblGrid>
-              <w:gridCol w:w="684"/>
-              <w:gridCol w:w="840"/>
-              <w:gridCol w:w="840"/>
-              <w:gridCol w:w="746"/>
+              <w:gridCol w:w="540"/>
+              <w:gridCol w:w="1060"/>
+              <w:gridCol w:w="1000"/>
+              <w:gridCol w:w="592"/>
             </w:tblGrid>
             <w:tr>
               <w:tc>
                 <w:tcPr>
-                  <w:tcW w:type="dxa" w:w="685"/>
+                  <w:tcW w:type="dxa" w:w="540"/>
                   <w:shd w:val="clear" w:fill="222222"/>
                 </w:tcPr>
                 <w:p>
                   <w:pPr>
                     <w:spacing w:before="20" w:after="20" w:line="240" w:lineRule="auto"/>
+                    <w:jc w:val="center"/>
                   </w:pPr>
                   <w:r/>
                   <w:r>
@@ -2968,12 +2974,13 @@
               </w:tc>
               <w:tc>
                 <w:tcPr>
-                  <w:tcW w:type="dxa" w:w="840"/>
+                  <w:tcW w:type="dxa" w:w="1060"/>
                   <w:shd w:val="clear" w:fill="222222"/>
                 </w:tcPr>
                 <w:p>
                   <w:pPr>
                     <w:spacing w:before="20" w:after="20" w:line="240" w:lineRule="auto"/>
+                    <w:jc w:val="center"/>
                   </w:pPr>
                   <w:r/>
                   <w:r>
@@ -2989,12 +2996,13 @@
               </w:tc>
               <w:tc>
                 <w:tcPr>
-                  <w:tcW w:type="dxa" w:w="840"/>
+                  <w:tcW w:type="dxa" w:w="1000"/>
                   <w:shd w:val="clear" w:fill="222222"/>
                 </w:tcPr>
                 <w:p>
                   <w:pPr>
                     <w:spacing w:before="20" w:after="20" w:line="240" w:lineRule="auto"/>
+                    <w:jc w:val="center"/>
                   </w:pPr>
                   <w:r/>
                   <w:r>
@@ -3010,12 +3018,13 @@
               </w:tc>
               <w:tc>
                 <w:tcPr>
-                  <w:tcW w:type="dxa" w:w="747"/>
+                  <w:tcW w:type="dxa" w:w="592"/>
                   <w:shd w:val="clear" w:fill="222222"/>
                 </w:tcPr>
                 <w:p>
                   <w:pPr>
                     <w:spacing w:before="20" w:after="20" w:line="240" w:lineRule="auto"/>
+                    <w:jc w:val="center"/>
                   </w:pPr>
                   <w:r/>
                   <w:r>
@@ -3033,7 +3042,7 @@
             <w:tr>
               <w:tc>
                 <w:tcPr>
-                  <w:tcW w:type="dxa" w:w="685"/>
+                  <w:tcW w:type="dxa" w:w="540"/>
                 </w:tcPr>
                 <w:p>
                   <w:pPr>
@@ -3054,7 +3063,7 @@
               </w:tc>
               <w:tc>
                 <w:tcPr>
-                  <w:tcW w:type="dxa" w:w="840"/>
+                  <w:tcW w:type="dxa" w:w="1060"/>
                 </w:tcPr>
                 <w:p>
                   <w:pPr>
@@ -3075,7 +3084,7 @@
               </w:tc>
               <w:tc>
                 <w:tcPr>
-                  <w:tcW w:type="dxa" w:w="840"/>
+                  <w:tcW w:type="dxa" w:w="1000"/>
                 </w:tcPr>
                 <w:p>
                   <w:pPr>
@@ -3096,7 +3105,7 @@
               </w:tc>
               <w:tc>
                 <w:tcPr>
-                  <w:tcW w:type="dxa" w:w="747"/>
+                  <w:tcW w:type="dxa" w:w="592"/>
                 </w:tcPr>
                 <w:p>
                   <w:pPr>
@@ -3119,7 +3128,7 @@
             <w:tr>
               <w:tc>
                 <w:tcPr>
-                  <w:tcW w:type="dxa" w:w="685"/>
+                  <w:tcW w:type="dxa" w:w="540"/>
                   <w:shd w:val="clear" w:fill="F7F7F7"/>
                 </w:tcPr>
                 <w:p>
@@ -3141,7 +3150,7 @@
               </w:tc>
               <w:tc>
                 <w:tcPr>
-                  <w:tcW w:type="dxa" w:w="840"/>
+                  <w:tcW w:type="dxa" w:w="1060"/>
                   <w:shd w:val="clear" w:fill="F7F7F7"/>
                 </w:tcPr>
                 <w:p>
@@ -3163,7 +3172,7 @@
               </w:tc>
               <w:tc>
                 <w:tcPr>
-                  <w:tcW w:type="dxa" w:w="840"/>
+                  <w:tcW w:type="dxa" w:w="1000"/>
                   <w:shd w:val="clear" w:fill="F7F7F7"/>
                 </w:tcPr>
                 <w:p>
@@ -3185,7 +3194,7 @@
               </w:tc>
               <w:tc>
                 <w:tcPr>
-                  <w:tcW w:type="dxa" w:w="747"/>
+                  <w:tcW w:type="dxa" w:w="592"/>
                   <w:shd w:val="clear" w:fill="F7F7F7"/>
                 </w:tcPr>
                 <w:p>
@@ -3209,7 +3218,7 @@
             <w:tr>
               <w:tc>
                 <w:tcPr>
-                  <w:tcW w:type="dxa" w:w="685"/>
+                  <w:tcW w:type="dxa" w:w="540"/>
                 </w:tcPr>
                 <w:p>
                   <w:pPr>
@@ -3230,7 +3239,7 @@
               </w:tc>
               <w:tc>
                 <w:tcPr>
-                  <w:tcW w:type="dxa" w:w="840"/>
+                  <w:tcW w:type="dxa" w:w="1060"/>
                 </w:tcPr>
                 <w:p>
                   <w:pPr>
@@ -3251,7 +3260,7 @@
               </w:tc>
               <w:tc>
                 <w:tcPr>
-                  <w:tcW w:type="dxa" w:w="840"/>
+                  <w:tcW w:type="dxa" w:w="1000"/>
                 </w:tcPr>
                 <w:p>
                   <w:pPr>
@@ -3272,7 +3281,7 @@
               </w:tc>
               <w:tc>
                 <w:tcPr>
-                  <w:tcW w:type="dxa" w:w="747"/>
+                  <w:tcW w:type="dxa" w:w="592"/>
                 </w:tcPr>
                 <w:p>
                   <w:pPr>
@@ -3293,7 +3302,9 @@
               </w:tc>
             </w:tr>
           </w:tbl>
-          <w:p/>
+          <w:p>
+            <w:pPr/>
+          </w:p>
         </w:tc>
         <w:tc>
           <w:tcPr>
@@ -3316,7 +3327,7 @@
           </w:p>
           <w:tbl>
             <w:tblPr>
-              <w:tblW w:type="auto" w:w="0"/>
+              <w:tblW w:type="dxa" w:w="3192"/>
               <w:tblLook w:firstColumn="1" w:firstRow="1" w:lastColumn="0" w:lastRow="0" w:noHBand="0" w:noVBand="1" w:val="04A0"/>
               <w:tblLayout w:type="fixed"/>
               <w:tblBorders>
@@ -3327,28 +3338,28 @@
                 <w:insideH w:val="single" w:sz="4" w:space="0" w:color="DDDDDD"/>
                 <w:insideV w:val="single" w:sz="4" w:space="0" w:color="DDDDDD"/>
               </w:tblBorders>
+              <w:jc w:val="center"/>
               <w:tblCellMar>
-                <w:top w:w="8" w:type="dxa"/>
-                <w:bottom w:w="8" w:type="dxa"/>
-                <w:left w:w="60" w:type="dxa"/>
-                <w:right w:w="60" w:type="dxa"/>
+                <w:left w:w="50" w:type="dxa"/>
+                <w:right w:w="50" w:type="dxa"/>
               </w:tblCellMar>
             </w:tblPr>
             <w:tblGrid>
-              <w:gridCol w:w="684"/>
-              <w:gridCol w:w="840"/>
-              <w:gridCol w:w="840"/>
-              <w:gridCol w:w="746"/>
+              <w:gridCol w:w="540"/>
+              <w:gridCol w:w="1060"/>
+              <w:gridCol w:w="1000"/>
+              <w:gridCol w:w="592"/>
             </w:tblGrid>
             <w:tr>
               <w:tc>
                 <w:tcPr>
-                  <w:tcW w:type="dxa" w:w="685"/>
+                  <w:tcW w:type="dxa" w:w="540"/>
                   <w:shd w:val="clear" w:fill="222222"/>
                 </w:tcPr>
                 <w:p>
                   <w:pPr>
                     <w:spacing w:before="20" w:after="20" w:line="240" w:lineRule="auto"/>
+                    <w:jc w:val="center"/>
                   </w:pPr>
                   <w:r/>
                   <w:r>
@@ -3364,12 +3375,13 @@
               </w:tc>
               <w:tc>
                 <w:tcPr>
-                  <w:tcW w:type="dxa" w:w="840"/>
+                  <w:tcW w:type="dxa" w:w="1060"/>
                   <w:shd w:val="clear" w:fill="222222"/>
                 </w:tcPr>
                 <w:p>
                   <w:pPr>
                     <w:spacing w:before="20" w:after="20" w:line="240" w:lineRule="auto"/>
+                    <w:jc w:val="center"/>
                   </w:pPr>
                   <w:r/>
                   <w:r>
@@ -3385,12 +3397,13 @@
               </w:tc>
               <w:tc>
                 <w:tcPr>
-                  <w:tcW w:type="dxa" w:w="840"/>
+                  <w:tcW w:type="dxa" w:w="1000"/>
                   <w:shd w:val="clear" w:fill="222222"/>
                 </w:tcPr>
                 <w:p>
                   <w:pPr>
                     <w:spacing w:before="20" w:after="20" w:line="240" w:lineRule="auto"/>
+                    <w:jc w:val="center"/>
                   </w:pPr>
                   <w:r/>
                   <w:r>
@@ -3406,12 +3419,13 @@
               </w:tc>
               <w:tc>
                 <w:tcPr>
-                  <w:tcW w:type="dxa" w:w="747"/>
+                  <w:tcW w:type="dxa" w:w="592"/>
                   <w:shd w:val="clear" w:fill="222222"/>
                 </w:tcPr>
                 <w:p>
                   <w:pPr>
                     <w:spacing w:before="20" w:after="20" w:line="240" w:lineRule="auto"/>
+                    <w:jc w:val="center"/>
                   </w:pPr>
                   <w:r/>
                   <w:r>
@@ -3429,7 +3443,7 @@
             <w:tr>
               <w:tc>
                 <w:tcPr>
-                  <w:tcW w:type="dxa" w:w="685"/>
+                  <w:tcW w:type="dxa" w:w="540"/>
                 </w:tcPr>
                 <w:p>
                   <w:pPr>
@@ -3450,7 +3464,7 @@
               </w:tc>
               <w:tc>
                 <w:tcPr>
-                  <w:tcW w:type="dxa" w:w="840"/>
+                  <w:tcW w:type="dxa" w:w="1060"/>
                 </w:tcPr>
                 <w:p>
                   <w:pPr>
@@ -3471,7 +3485,7 @@
               </w:tc>
               <w:tc>
                 <w:tcPr>
-                  <w:tcW w:type="dxa" w:w="840"/>
+                  <w:tcW w:type="dxa" w:w="1000"/>
                 </w:tcPr>
                 <w:p>
                   <w:pPr>
@@ -3492,7 +3506,7 @@
               </w:tc>
               <w:tc>
                 <w:tcPr>
-                  <w:tcW w:type="dxa" w:w="747"/>
+                  <w:tcW w:type="dxa" w:w="592"/>
                 </w:tcPr>
                 <w:p>
                   <w:pPr>
@@ -3515,7 +3529,7 @@
             <w:tr>
               <w:tc>
                 <w:tcPr>
-                  <w:tcW w:type="dxa" w:w="685"/>
+                  <w:tcW w:type="dxa" w:w="540"/>
                   <w:shd w:val="clear" w:fill="F7F7F7"/>
                 </w:tcPr>
                 <w:p>
@@ -3537,7 +3551,7 @@
               </w:tc>
               <w:tc>
                 <w:tcPr>
-                  <w:tcW w:type="dxa" w:w="840"/>
+                  <w:tcW w:type="dxa" w:w="1060"/>
                   <w:shd w:val="clear" w:fill="F7F7F7"/>
                 </w:tcPr>
                 <w:p>
@@ -3559,7 +3573,7 @@
               </w:tc>
               <w:tc>
                 <w:tcPr>
-                  <w:tcW w:type="dxa" w:w="840"/>
+                  <w:tcW w:type="dxa" w:w="1000"/>
                   <w:shd w:val="clear" w:fill="F7F7F7"/>
                 </w:tcPr>
                 <w:p>
@@ -3581,7 +3595,7 @@
               </w:tc>
               <w:tc>
                 <w:tcPr>
-                  <w:tcW w:type="dxa" w:w="747"/>
+                  <w:tcW w:type="dxa" w:w="592"/>
                   <w:shd w:val="clear" w:fill="F7F7F7"/>
                 </w:tcPr>
                 <w:p>
@@ -3605,7 +3619,7 @@
             <w:tr>
               <w:tc>
                 <w:tcPr>
-                  <w:tcW w:type="dxa" w:w="685"/>
+                  <w:tcW w:type="dxa" w:w="540"/>
                 </w:tcPr>
                 <w:p>
                   <w:pPr>
@@ -3626,7 +3640,7 @@
               </w:tc>
               <w:tc>
                 <w:tcPr>
-                  <w:tcW w:type="dxa" w:w="840"/>
+                  <w:tcW w:type="dxa" w:w="1060"/>
                 </w:tcPr>
                 <w:p>
                   <w:pPr>
@@ -3647,7 +3661,7 @@
               </w:tc>
               <w:tc>
                 <w:tcPr>
-                  <w:tcW w:type="dxa" w:w="840"/>
+                  <w:tcW w:type="dxa" w:w="1000"/>
                 </w:tcPr>
                 <w:p>
                   <w:pPr>
@@ -3668,7 +3682,7 @@
               </w:tc>
               <w:tc>
                 <w:tcPr>
-                  <w:tcW w:type="dxa" w:w="747"/>
+                  <w:tcW w:type="dxa" w:w="592"/>
                 </w:tcPr>
                 <w:p>
                   <w:pPr>
@@ -3689,7 +3703,9 @@
               </w:tc>
             </w:tr>
           </w:tbl>
-          <w:p/>
+          <w:p>
+            <w:pPr/>
+          </w:p>
         </w:tc>
       </w:tr>
     </w:tbl>
@@ -3784,22 +3800,7 @@
           <w:color w:val="222222"/>
           <w:sz w:val="20"/>
         </w:rPr>
-        <w:t>Jesse Utsey  |  Project Manager, USADebusk</w:t>
-      </w:r>
-    </w:p>
-    <w:p>
-      <w:pPr>
-        <w:keepNext w:val="0"/>
-        <w:spacing w:before="0" w:after="0"/>
-      </w:pPr>
-      <w:r>
-        <w:rPr>
-          <w:rFonts w:ascii="Arial" w:hAnsi="Arial"/>
-          <w:b w:val="0"/>
-          <w:color w:val="222222"/>
-          <w:sz w:val="20"/>
-        </w:rPr>
-        <w:t>713-252-8516  |  JUtsey@USADebusk.com</w:t>
+        <w:t>Peter Campbell  |  Project Manager, USADebusk</w:t>
       </w:r>
     </w:p>
     <w:sectPr>

</xml_diff>